<commit_message>
Codigo: Preprocesamiento de radiografías
</commit_message>
<xml_diff>
--- a/Semana4.docx
+++ b/Semana4.docx
@@ -3,6 +3,8 @@
 <w:document xmlns:wpc="http://schemas.microsoft.com/office/word/2010/wordprocessingCanvas" xmlns:cx="http://schemas.microsoft.com/office/drawing/2014/chartex" xmlns:mc="http://schemas.openxmlformats.org/markup-compatibility/2006" xmlns:o="urn:schemas-microsoft-com:office:office" xmlns:r="http://schemas.openxmlformats.org/officeDocument/2006/relationships" xmlns:m="http://schemas.openxmlformats.org/officeDocument/2006/math" xmlns:v="urn:schemas-microsoft-com:vml" xmlns:wp14="http://schemas.microsoft.com/office/word/2010/wordprocessingDrawing" xmlns:wp="http://schemas.openxmlformats.org/drawingml/2006/wordprocessingDrawing" xmlns:w10="urn:schemas-microsoft-com:office:word" xmlns:w="http://schemas.openxmlformats.org/wordprocessingml/2006/main" xmlns:w14="http://schemas.microsoft.com/office/word/2010/wordml" xmlns:w15="http://schemas.microsoft.com/office/word/2012/wordml" xmlns:w16se="http://schemas.microsoft.com/office/word/2015/wordml/symex" xmlns:wpg="http://schemas.microsoft.com/office/word/2010/wordprocessingGroup" xmlns:wpi="http://schemas.microsoft.com/office/word/2010/wordprocessingInk" xmlns:wne="http://schemas.microsoft.com/office/word/2006/wordml" xmlns:wps="http://schemas.microsoft.com/office/word/2010/wordprocessingShape" mc:Ignorable="w14 w15 w16se wp14">
   <w:body>
     <w:p>
+      <w:bookmarkStart w:id="0" w:name="_GoBack"/>
+      <w:bookmarkEnd w:id="0"/>
       <w:r>
         <w:t xml:space="preserve">Para demostrar el avance del proyecto desde las primeras semanas, se realizarán </w:t>
       </w:r>
@@ -688,12 +690,707 @@
         <w:t xml:space="preserve"> representa el inicio formal del desarrollo y permite comprobar que el entorno y las herramientas principales funcionan correctamente.</w:t>
       </w:r>
     </w:p>
-    <w:p>
+    <w:p/>
+    <w:p>
+      <w:pPr>
+        <w:rPr>
+          <w:b/>
+          <w:bCs/>
+        </w:rPr>
+      </w:pPr>
+      <w:proofErr w:type="spellStart"/>
+      <w:r>
+        <w:rPr>
+          <w:b/>
+          <w:bCs/>
+        </w:rPr>
+        <w:lastRenderedPageBreak/>
+        <w:t>Preprocesamiento</w:t>
+      </w:r>
+      <w:proofErr w:type="spellEnd"/>
+      <w:r>
+        <w:rPr>
+          <w:b/>
+          <w:bCs/>
+        </w:rPr>
+        <w:t xml:space="preserve"> de radiografías</w:t>
+      </w:r>
+    </w:p>
+    <w:p>
+      <w:pPr>
+        <w:rPr>
+          <w:b/>
+          <w:bCs/>
+        </w:rPr>
+      </w:pPr>
+      <w:r>
+        <w:rPr>
+          <w:b/>
+          <w:bCs/>
+        </w:rPr>
+        <w:t>Objetivo</w:t>
+      </w:r>
+    </w:p>
+    <w:p>
+      <w:r>
+        <w:t xml:space="preserve">Implementar un proceso básico de </w:t>
+      </w:r>
+      <w:proofErr w:type="spellStart"/>
+      <w:r>
+        <w:t>preprocesamiento</w:t>
+      </w:r>
+      <w:proofErr w:type="spellEnd"/>
+      <w:r>
+        <w:t xml:space="preserve"> que permita preparar las radiografías antes de utilizarlas para el entrenamiento de la Inteligencia Artificial.</w:t>
+      </w:r>
+    </w:p>
+    <w:p>
+      <w:pPr>
+        <w:rPr>
+          <w:b/>
+          <w:bCs/>
+        </w:rPr>
+      </w:pPr>
+      <w:r>
+        <w:rPr>
+          <w:b/>
+          <w:bCs/>
+        </w:rPr>
+        <w:t>Acciones realizadas</w:t>
+      </w:r>
+    </w:p>
+    <w:p>
+      <w:pPr>
+        <w:numPr>
+          <w:ilvl w:val="0"/>
+          <w:numId w:val="2"/>
+        </w:numPr>
+      </w:pPr>
+      <w:r>
+        <w:t>Cargar las radiografías.</w:t>
+      </w:r>
+    </w:p>
+    <w:p>
+      <w:pPr>
+        <w:numPr>
+          <w:ilvl w:val="0"/>
+          <w:numId w:val="2"/>
+        </w:numPr>
+      </w:pPr>
+      <w:r>
+        <w:t>Convertir las imágenes a escala de grises.</w:t>
+      </w:r>
+    </w:p>
+    <w:p>
+      <w:pPr>
+        <w:numPr>
+          <w:ilvl w:val="0"/>
+          <w:numId w:val="2"/>
+        </w:numPr>
+      </w:pPr>
+      <w:r>
+        <w:t>Redimensionar las imágenes a un tamaño uniforme de 224 × 224 píxeles.</w:t>
+      </w:r>
+    </w:p>
+    <w:p>
+      <w:pPr>
+        <w:numPr>
+          <w:ilvl w:val="0"/>
+          <w:numId w:val="2"/>
+        </w:numPr>
+      </w:pPr>
+      <w:r>
+        <w:t>Normalizar los valores de los píxeles.</w:t>
+      </w:r>
+    </w:p>
+    <w:p>
+      <w:pPr>
+        <w:numPr>
+          <w:ilvl w:val="0"/>
+          <w:numId w:val="2"/>
+        </w:numPr>
+      </w:pPr>
+      <w:r>
+        <w:t xml:space="preserve">Mostrar el resultado del </w:t>
+      </w:r>
+      <w:proofErr w:type="spellStart"/>
+      <w:r>
+        <w:t>preprocesamiento</w:t>
+      </w:r>
+      <w:proofErr w:type="spellEnd"/>
+      <w:r>
+        <w:t>.</w:t>
+      </w:r>
+    </w:p>
+    <w:p>
+      <w:pPr>
+        <w:numPr>
+          <w:ilvl w:val="0"/>
+          <w:numId w:val="2"/>
+        </w:numPr>
+      </w:pPr>
+      <w:r>
+        <w:t>Verificar que las imágenes tengan el formato adecuado para etapas posteriores.</w:t>
+      </w:r>
+    </w:p>
+    <w:p>
+      <w:pPr>
+        <w:rPr>
+          <w:b/>
+          <w:bCs/>
+        </w:rPr>
+      </w:pPr>
+      <w:r>
+        <w:rPr>
+          <w:b/>
+          <w:bCs/>
+        </w:rPr>
+        <w:t xml:space="preserve">Código de </w:t>
+      </w:r>
+      <w:proofErr w:type="spellStart"/>
+      <w:r>
+        <w:rPr>
+          <w:b/>
+          <w:bCs/>
+        </w:rPr>
+        <w:t>preprocesamiento</w:t>
+      </w:r>
+      <w:proofErr w:type="spellEnd"/>
+    </w:p>
+    <w:p>
+      <w:r>
+        <w:t>Se desarrollará el archivo preprocesamiento.py:</w:t>
+      </w:r>
+    </w:p>
+    <w:p>
+      <w:proofErr w:type="spellStart"/>
+      <w:r>
+        <w:t>import</w:t>
+      </w:r>
+      <w:proofErr w:type="spellEnd"/>
+      <w:r>
+        <w:t xml:space="preserve"> cv2</w:t>
+      </w:r>
+    </w:p>
+    <w:p>
+      <w:proofErr w:type="spellStart"/>
+      <w:r>
+        <w:t>import</w:t>
+      </w:r>
+      <w:proofErr w:type="spellEnd"/>
       <w:r>
         <w:t xml:space="preserve"> </w:t>
       </w:r>
-      <w:bookmarkStart w:id="0" w:name="_GoBack"/>
-      <w:bookmarkEnd w:id="0"/>
+      <w:proofErr w:type="spellStart"/>
+      <w:r>
+        <w:t>numpy</w:t>
+      </w:r>
+      <w:proofErr w:type="spellEnd"/>
+      <w:r>
+        <w:t xml:space="preserve"> as </w:t>
+      </w:r>
+      <w:proofErr w:type="spellStart"/>
+      <w:r>
+        <w:t>np</w:t>
+      </w:r>
+      <w:proofErr w:type="spellEnd"/>
+    </w:p>
+    <w:p>
+      <w:proofErr w:type="spellStart"/>
+      <w:r>
+        <w:t>import</w:t>
+      </w:r>
+      <w:proofErr w:type="spellEnd"/>
+      <w:r>
+        <w:t xml:space="preserve"> </w:t>
+      </w:r>
+      <w:proofErr w:type="spellStart"/>
+      <w:proofErr w:type="gramStart"/>
+      <w:r>
+        <w:t>matplotlib.pyplot</w:t>
+      </w:r>
+      <w:proofErr w:type="spellEnd"/>
+      <w:proofErr w:type="gramEnd"/>
+      <w:r>
+        <w:t xml:space="preserve"> as </w:t>
+      </w:r>
+      <w:proofErr w:type="spellStart"/>
+      <w:r>
+        <w:t>plt</w:t>
+      </w:r>
+      <w:proofErr w:type="spellEnd"/>
+    </w:p>
+    <w:p>
+      <w:proofErr w:type="spellStart"/>
+      <w:r>
+        <w:t>def</w:t>
+      </w:r>
+      <w:proofErr w:type="spellEnd"/>
+      <w:r>
+        <w:t xml:space="preserve"> </w:t>
+      </w:r>
+      <w:proofErr w:type="spellStart"/>
+      <w:r>
+        <w:t>preprocesar_</w:t>
+      </w:r>
+      <w:proofErr w:type="gramStart"/>
+      <w:r>
+        <w:t>imagen</w:t>
+      </w:r>
+      <w:proofErr w:type="spellEnd"/>
+      <w:r>
+        <w:t>(</w:t>
+      </w:r>
+      <w:proofErr w:type="gramEnd"/>
+      <w:r>
+        <w:t>ruta, tamaño=(224, 224)):</w:t>
+      </w:r>
+    </w:p>
+    <w:p>
+      <w:r>
+        <w:t xml:space="preserve">    # Cargar imagen en escala de grises</w:t>
+      </w:r>
+    </w:p>
+    <w:p>
+      <w:r>
+        <w:t xml:space="preserve">    imagen = cv2.imread(ruta, cv2.IMREAD_GRAYSCALE)</w:t>
+      </w:r>
+    </w:p>
+    <w:p>
+      <w:r>
+        <w:t xml:space="preserve">    </w:t>
+      </w:r>
+      <w:proofErr w:type="spellStart"/>
+      <w:r>
+        <w:t>if</w:t>
+      </w:r>
+      <w:proofErr w:type="spellEnd"/>
+      <w:r>
+        <w:t xml:space="preserve"> imagen </w:t>
+      </w:r>
+      <w:proofErr w:type="spellStart"/>
+      <w:r>
+        <w:t>is</w:t>
+      </w:r>
+      <w:proofErr w:type="spellEnd"/>
+      <w:r>
+        <w:t xml:space="preserve"> </w:t>
+      </w:r>
+      <w:proofErr w:type="spellStart"/>
+      <w:r>
+        <w:t>None</w:t>
+      </w:r>
+      <w:proofErr w:type="spellEnd"/>
+      <w:r>
+        <w:t>:</w:t>
+      </w:r>
+    </w:p>
+    <w:p>
+      <w:r>
+        <w:t xml:space="preserve">        </w:t>
+      </w:r>
+      <w:proofErr w:type="spellStart"/>
+      <w:r>
+        <w:t>raise</w:t>
+      </w:r>
+      <w:proofErr w:type="spellEnd"/>
+      <w:r>
+        <w:t xml:space="preserve"> </w:t>
+      </w:r>
+      <w:proofErr w:type="spellStart"/>
+      <w:proofErr w:type="gramStart"/>
+      <w:r>
+        <w:t>FileNotFoundError</w:t>
+      </w:r>
+      <w:proofErr w:type="spellEnd"/>
+      <w:r>
+        <w:t>(</w:t>
+      </w:r>
+      <w:proofErr w:type="gramEnd"/>
+    </w:p>
+    <w:p>
+      <w:r>
+        <w:t xml:space="preserve">            </w:t>
+      </w:r>
+      <w:proofErr w:type="spellStart"/>
+      <w:r>
+        <w:t>f"No</w:t>
+      </w:r>
+      <w:proofErr w:type="spellEnd"/>
+      <w:r>
+        <w:t xml:space="preserve"> se encontró la imagen: {ruta}"</w:t>
+      </w:r>
+    </w:p>
+    <w:p>
+      <w:r>
+        <w:t xml:space="preserve">        )</w:t>
+      </w:r>
+    </w:p>
+    <w:p>
+      <w:r>
+        <w:t xml:space="preserve">    # Redimensionar imagen</w:t>
+      </w:r>
+    </w:p>
+    <w:p>
+      <w:r>
+        <w:t xml:space="preserve">    </w:t>
+      </w:r>
+      <w:proofErr w:type="spellStart"/>
+      <w:r>
+        <w:t>imagen_redimensionada</w:t>
+      </w:r>
+      <w:proofErr w:type="spellEnd"/>
+      <w:r>
+        <w:t xml:space="preserve"> = cv2.resize(</w:t>
+      </w:r>
+    </w:p>
+    <w:p>
+      <w:r>
+        <w:t xml:space="preserve">        imagen,</w:t>
+      </w:r>
+    </w:p>
+    <w:p>
+      <w:r>
+        <w:t xml:space="preserve">        tamaño</w:t>
+      </w:r>
+    </w:p>
+    <w:p>
+      <w:r>
+        <w:t xml:space="preserve">    )</w:t>
+      </w:r>
+    </w:p>
+    <w:p>
+      <w:r>
+        <w:t># Normalizar valores de 0-255 a 0-1</w:t>
+      </w:r>
+    </w:p>
+    <w:p>
+      <w:r>
+        <w:lastRenderedPageBreak/>
+        <w:t xml:space="preserve">    </w:t>
+      </w:r>
+      <w:proofErr w:type="spellStart"/>
+      <w:r>
+        <w:t>imagen_normalizada</w:t>
+      </w:r>
+      <w:proofErr w:type="spellEnd"/>
+      <w:r>
+        <w:t xml:space="preserve"> = (</w:t>
+      </w:r>
+    </w:p>
+    <w:p>
+      <w:r>
+        <w:t xml:space="preserve">        </w:t>
+      </w:r>
+      <w:proofErr w:type="spellStart"/>
+      <w:r>
+        <w:t>imagen_redimensionada</w:t>
+      </w:r>
+      <w:proofErr w:type="spellEnd"/>
+      <w:r>
+        <w:t xml:space="preserve"> / 255.0</w:t>
+      </w:r>
+    </w:p>
+    <w:p>
+      <w:r>
+        <w:t xml:space="preserve">    )</w:t>
+      </w:r>
+    </w:p>
+    <w:p>
+      <w:r>
+        <w:t xml:space="preserve">    </w:t>
+      </w:r>
+      <w:proofErr w:type="spellStart"/>
+      <w:r>
+        <w:t>return</w:t>
+      </w:r>
+      <w:proofErr w:type="spellEnd"/>
+      <w:r>
+        <w:t xml:space="preserve"> </w:t>
+      </w:r>
+      <w:proofErr w:type="spellStart"/>
+      <w:r>
+        <w:t>imagen_normalizada</w:t>
+      </w:r>
+      <w:proofErr w:type="spellEnd"/>
+    </w:p>
+    <w:p>
+      <w:r>
+        <w:t>ruta = "data/ejemplo.jpg"</w:t>
+      </w:r>
+    </w:p>
+    <w:p>
+      <w:r>
+        <w:t xml:space="preserve">imagen = </w:t>
+      </w:r>
+      <w:proofErr w:type="spellStart"/>
+      <w:r>
+        <w:t>preprocesar_imagen</w:t>
+      </w:r>
+      <w:proofErr w:type="spellEnd"/>
+      <w:r>
+        <w:t>(ruta)</w:t>
+      </w:r>
+    </w:p>
+    <w:p>
+      <w:proofErr w:type="spellStart"/>
+      <w:proofErr w:type="gramStart"/>
+      <w:r>
+        <w:t>print</w:t>
+      </w:r>
+      <w:proofErr w:type="spellEnd"/>
+      <w:r>
+        <w:t>(</w:t>
+      </w:r>
+      <w:proofErr w:type="gramEnd"/>
+      <w:r>
+        <w:t>"Imagen procesada")</w:t>
+      </w:r>
+    </w:p>
+    <w:p>
+      <w:proofErr w:type="spellStart"/>
+      <w:proofErr w:type="gramStart"/>
+      <w:r>
+        <w:t>print</w:t>
+      </w:r>
+      <w:proofErr w:type="spellEnd"/>
+      <w:r>
+        <w:t>(</w:t>
+      </w:r>
+      <w:proofErr w:type="gramEnd"/>
+      <w:r>
+        <w:t xml:space="preserve">"Dimensiones:", </w:t>
+      </w:r>
+      <w:proofErr w:type="spellStart"/>
+      <w:r>
+        <w:t>imagen.shape</w:t>
+      </w:r>
+      <w:proofErr w:type="spellEnd"/>
+      <w:r>
+        <w:t>)</w:t>
+      </w:r>
+    </w:p>
+    <w:p>
+      <w:proofErr w:type="spellStart"/>
+      <w:proofErr w:type="gramStart"/>
+      <w:r>
+        <w:t>print</w:t>
+      </w:r>
+      <w:proofErr w:type="spellEnd"/>
+      <w:r>
+        <w:t>(</w:t>
+      </w:r>
+      <w:proofErr w:type="gramEnd"/>
+      <w:r>
+        <w:t xml:space="preserve">"Valor mínimo:", </w:t>
+      </w:r>
+      <w:proofErr w:type="spellStart"/>
+      <w:r>
+        <w:t>imagen.min</w:t>
+      </w:r>
+      <w:proofErr w:type="spellEnd"/>
+      <w:r>
+        <w:t>())</w:t>
+      </w:r>
+    </w:p>
+    <w:p>
+      <w:proofErr w:type="spellStart"/>
+      <w:proofErr w:type="gramStart"/>
+      <w:r>
+        <w:t>print</w:t>
+      </w:r>
+      <w:proofErr w:type="spellEnd"/>
+      <w:r>
+        <w:t>(</w:t>
+      </w:r>
+      <w:proofErr w:type="gramEnd"/>
+      <w:r>
+        <w:t xml:space="preserve">"Valor máximo:", </w:t>
+      </w:r>
+      <w:proofErr w:type="spellStart"/>
+      <w:r>
+        <w:t>imagen.max</w:t>
+      </w:r>
+      <w:proofErr w:type="spellEnd"/>
+      <w:r>
+        <w:t>())</w:t>
+      </w:r>
+    </w:p>
+    <w:p>
+      <w:proofErr w:type="spellStart"/>
+      <w:proofErr w:type="gramStart"/>
+      <w:r>
+        <w:t>plt.imshow</w:t>
+      </w:r>
+      <w:proofErr w:type="spellEnd"/>
+      <w:proofErr w:type="gramEnd"/>
+      <w:r>
+        <w:t xml:space="preserve">(imagen, </w:t>
+      </w:r>
+      <w:proofErr w:type="spellStart"/>
+      <w:r>
+        <w:t>cmap</w:t>
+      </w:r>
+      <w:proofErr w:type="spellEnd"/>
+      <w:r>
+        <w:t>="gray")</w:t>
+      </w:r>
+    </w:p>
+    <w:p>
+      <w:proofErr w:type="spellStart"/>
+      <w:proofErr w:type="gramStart"/>
+      <w:r>
+        <w:t>plt.title</w:t>
+      </w:r>
+      <w:proofErr w:type="spellEnd"/>
+      <w:proofErr w:type="gramEnd"/>
+      <w:r>
+        <w:t xml:space="preserve">("Radiografía </w:t>
+      </w:r>
+      <w:proofErr w:type="spellStart"/>
+      <w:r>
+        <w:t>preprocesada</w:t>
+      </w:r>
+      <w:proofErr w:type="spellEnd"/>
+      <w:r>
+        <w:t>")</w:t>
+      </w:r>
+    </w:p>
+    <w:p>
+      <w:proofErr w:type="spellStart"/>
+      <w:proofErr w:type="gramStart"/>
+      <w:r>
+        <w:t>plt.axis</w:t>
+      </w:r>
+      <w:proofErr w:type="spellEnd"/>
+      <w:proofErr w:type="gramEnd"/>
+      <w:r>
+        <w:t>("off")</w:t>
+      </w:r>
+    </w:p>
+    <w:p>
+      <w:proofErr w:type="spellStart"/>
+      <w:proofErr w:type="gramStart"/>
+      <w:r>
+        <w:t>plt.show</w:t>
+      </w:r>
+      <w:proofErr w:type="spellEnd"/>
+      <w:proofErr w:type="gramEnd"/>
+      <w:r>
+        <w:t>()</w:t>
+      </w:r>
+    </w:p>
+    <w:p>
+      <w:pPr>
+        <w:rPr>
+          <w:b/>
+          <w:bCs/>
+        </w:rPr>
+      </w:pPr>
+      <w:r>
+        <w:rPr>
+          <w:b/>
+          <w:bCs/>
+        </w:rPr>
+        <w:t>Flujo del procesamiento</w:t>
+      </w:r>
+    </w:p>
+    <w:p>
+      <w:r>
+        <w:t>El procesamiento realizado durante esta etapa seguirá el siguiente flujo:</w:t>
+      </w:r>
+    </w:p>
+    <w:p>
+      <w:r>
+        <w:rPr>
+          <w:b/>
+          <w:bCs/>
+        </w:rPr>
+        <w:t>Radiografía original → Escala de grises → Redimensionamiento → Normalización → Imagen procesada</w:t>
+      </w:r>
+    </w:p>
+    <w:p>
+      <w:r>
+        <w:t>La normalización permitirá convertir los valores originales de los píxeles, que normalmente se encuentran entre 0 y 255, a un rango entre 0 y 1.</w:t>
+      </w:r>
+    </w:p>
+    <w:p>
+      <w:pPr>
+        <w:rPr>
+          <w:b/>
+          <w:bCs/>
+        </w:rPr>
+      </w:pPr>
+      <w:r>
+        <w:rPr>
+          <w:b/>
+          <w:bCs/>
+        </w:rPr>
+        <w:t>Producto Mínimo Viable</w:t>
+      </w:r>
+    </w:p>
+    <w:p>
+      <w:r>
+        <w:t>Al finalizar este avance, el sistema deberá ser capaz de:</w:t>
+      </w:r>
+    </w:p>
+    <w:p>
+      <w:r>
+        <w:rPr>
+          <w:b/>
+          <w:bCs/>
+        </w:rPr>
+        <w:t>Cargar una radiografía → convertirla a escala de grises → redimensionarla → normalizarla → mostrar la imagen procesada.</w:t>
+      </w:r>
+    </w:p>
+    <w:p>
+      <w:proofErr w:type="spellStart"/>
+      <w:r>
+        <w:t>feat</w:t>
+      </w:r>
+      <w:proofErr w:type="spellEnd"/>
+      <w:r>
+        <w:t xml:space="preserve">: agregar </w:t>
+      </w:r>
+      <w:proofErr w:type="spellStart"/>
+      <w:r>
+        <w:t>preprocesamiento</w:t>
+      </w:r>
+      <w:proofErr w:type="spellEnd"/>
+      <w:r>
+        <w:t xml:space="preserve"> de </w:t>
+      </w:r>
+      <w:proofErr w:type="spellStart"/>
+      <w:r>
+        <w:t>radiografias</w:t>
+      </w:r>
+      <w:proofErr w:type="spellEnd"/>
+    </w:p>
+    <w:p>
+      <w:r>
+        <w:t xml:space="preserve">Este segundo </w:t>
+      </w:r>
+      <w:proofErr w:type="spellStart"/>
+      <w:r>
+        <w:t>commit</w:t>
+      </w:r>
+      <w:proofErr w:type="spellEnd"/>
+      <w:r>
+        <w:t xml:space="preserve"> demuestra que el proyecto ya cuenta con un primer proceso de preparación de imágenes para su posterior utilización en un modelo de Inteligencia Artificial.</w:t>
+      </w:r>
+    </w:p>
+    <w:p/>
+    <w:p/>
+    <w:p/>
+    <w:p/>
+    <w:p/>
+    <w:p/>
+    <w:p/>
+    <w:p/>
+    <w:p>
+      <w:r>
+        <w:t xml:space="preserve"> </w:t>
+      </w:r>
     </w:p>
     <w:sectPr>
       <w:pgSz w:w="12240" w:h="15840"/>
@@ -708,6 +1405,119 @@
 <file path=word/numbering.xml><?xml version="1.0" encoding="utf-8"?>
 <w:numbering xmlns:wpc="http://schemas.microsoft.com/office/word/2010/wordprocessingCanvas" xmlns:cx="http://schemas.microsoft.com/office/drawing/2014/chartex" xmlns:mc="http://schemas.openxmlformats.org/markup-compatibility/2006" xmlns:o="urn:schemas-microsoft-com:office:office" xmlns:r="http://schemas.openxmlformats.org/officeDocument/2006/relationships" xmlns:m="http://schemas.openxmlformats.org/officeDocument/2006/math" xmlns:v="urn:schemas-microsoft-com:vml" xmlns:wp14="http://schemas.microsoft.com/office/word/2010/wordprocessingDrawing" xmlns:wp="http://schemas.openxmlformats.org/drawingml/2006/wordprocessingDrawing" xmlns:w10="urn:schemas-microsoft-com:office:word" xmlns:w="http://schemas.openxmlformats.org/wordprocessingml/2006/main" xmlns:w14="http://schemas.microsoft.com/office/word/2010/wordml" xmlns:w15="http://schemas.microsoft.com/office/word/2012/wordml" xmlns:w16se="http://schemas.microsoft.com/office/word/2015/wordml/symex" xmlns:wpg="http://schemas.microsoft.com/office/word/2010/wordprocessingGroup" xmlns:wpi="http://schemas.microsoft.com/office/word/2010/wordprocessingInk" xmlns:wne="http://schemas.microsoft.com/office/word/2006/wordml" xmlns:wps="http://schemas.microsoft.com/office/word/2010/wordprocessingShape" mc:Ignorable="w14 w15 w16se wp14">
   <w:abstractNum w:abstractNumId="0" w15:restartNumberingAfterBreak="0">
+    <w:nsid w:val="0A993C9C"/>
+    <w:multiLevelType w:val="multilevel"/>
+    <w:tmpl w:val="C040126A"/>
+    <w:lvl w:ilvl="0">
+      <w:start w:val="1"/>
+      <w:numFmt w:val="decimal"/>
+      <w:lvlText w:val="%1."/>
+      <w:lvlJc w:val="left"/>
+      <w:pPr>
+        <w:tabs>
+          <w:tab w:val="num" w:pos="720"/>
+        </w:tabs>
+        <w:ind w:left="720" w:hanging="360"/>
+      </w:pPr>
+    </w:lvl>
+    <w:lvl w:ilvl="1" w:tentative="1">
+      <w:start w:val="1"/>
+      <w:numFmt w:val="decimal"/>
+      <w:lvlText w:val="%2."/>
+      <w:lvlJc w:val="left"/>
+      <w:pPr>
+        <w:tabs>
+          <w:tab w:val="num" w:pos="1440"/>
+        </w:tabs>
+        <w:ind w:left="1440" w:hanging="360"/>
+      </w:pPr>
+    </w:lvl>
+    <w:lvl w:ilvl="2" w:tentative="1">
+      <w:start w:val="1"/>
+      <w:numFmt w:val="decimal"/>
+      <w:lvlText w:val="%3."/>
+      <w:lvlJc w:val="left"/>
+      <w:pPr>
+        <w:tabs>
+          <w:tab w:val="num" w:pos="2160"/>
+        </w:tabs>
+        <w:ind w:left="2160" w:hanging="360"/>
+      </w:pPr>
+    </w:lvl>
+    <w:lvl w:ilvl="3" w:tentative="1">
+      <w:start w:val="1"/>
+      <w:numFmt w:val="decimal"/>
+      <w:lvlText w:val="%4."/>
+      <w:lvlJc w:val="left"/>
+      <w:pPr>
+        <w:tabs>
+          <w:tab w:val="num" w:pos="2880"/>
+        </w:tabs>
+        <w:ind w:left="2880" w:hanging="360"/>
+      </w:pPr>
+    </w:lvl>
+    <w:lvl w:ilvl="4" w:tentative="1">
+      <w:start w:val="1"/>
+      <w:numFmt w:val="decimal"/>
+      <w:lvlText w:val="%5."/>
+      <w:lvlJc w:val="left"/>
+      <w:pPr>
+        <w:tabs>
+          <w:tab w:val="num" w:pos="3600"/>
+        </w:tabs>
+        <w:ind w:left="3600" w:hanging="360"/>
+      </w:pPr>
+    </w:lvl>
+    <w:lvl w:ilvl="5" w:tentative="1">
+      <w:start w:val="1"/>
+      <w:numFmt w:val="decimal"/>
+      <w:lvlText w:val="%6."/>
+      <w:lvlJc w:val="left"/>
+      <w:pPr>
+        <w:tabs>
+          <w:tab w:val="num" w:pos="4320"/>
+        </w:tabs>
+        <w:ind w:left="4320" w:hanging="360"/>
+      </w:pPr>
+    </w:lvl>
+    <w:lvl w:ilvl="6" w:tentative="1">
+      <w:start w:val="1"/>
+      <w:numFmt w:val="decimal"/>
+      <w:lvlText w:val="%7."/>
+      <w:lvlJc w:val="left"/>
+      <w:pPr>
+        <w:tabs>
+          <w:tab w:val="num" w:pos="5040"/>
+        </w:tabs>
+        <w:ind w:left="5040" w:hanging="360"/>
+      </w:pPr>
+    </w:lvl>
+    <w:lvl w:ilvl="7" w:tentative="1">
+      <w:start w:val="1"/>
+      <w:numFmt w:val="decimal"/>
+      <w:lvlText w:val="%8."/>
+      <w:lvlJc w:val="left"/>
+      <w:pPr>
+        <w:tabs>
+          <w:tab w:val="num" w:pos="5760"/>
+        </w:tabs>
+        <w:ind w:left="5760" w:hanging="360"/>
+      </w:pPr>
+    </w:lvl>
+    <w:lvl w:ilvl="8" w:tentative="1">
+      <w:start w:val="1"/>
+      <w:numFmt w:val="decimal"/>
+      <w:lvlText w:val="%9."/>
+      <w:lvlJc w:val="left"/>
+      <w:pPr>
+        <w:tabs>
+          <w:tab w:val="num" w:pos="6480"/>
+        </w:tabs>
+        <w:ind w:left="6480" w:hanging="360"/>
+      </w:pPr>
+    </w:lvl>
+  </w:abstractNum>
+  <w:abstractNum w:abstractNumId="1" w15:restartNumberingAfterBreak="0">
     <w:nsid w:val="489B2681"/>
     <w:multiLevelType w:val="multilevel"/>
     <w:tmpl w:val="BA8C12FE"/>
@@ -821,6 +1631,9 @@
     </w:lvl>
   </w:abstractNum>
   <w:num w:numId="1">
+    <w:abstractNumId w:val="1"/>
+  </w:num>
+  <w:num w:numId="2">
     <w:abstractNumId w:val="0"/>
   </w:num>
 </w:numbering>

</xml_diff>

<commit_message>
Codigo: Preparación del dataset para entrenamiento
</commit_message>
<xml_diff>
--- a/Semana4.docx
+++ b/Semana4.docx
@@ -3,8 +3,6 @@
 <w:document xmlns:wpc="http://schemas.microsoft.com/office/word/2010/wordprocessingCanvas" xmlns:cx="http://schemas.microsoft.com/office/drawing/2014/chartex" xmlns:mc="http://schemas.openxmlformats.org/markup-compatibility/2006" xmlns:o="urn:schemas-microsoft-com:office:office" xmlns:r="http://schemas.openxmlformats.org/officeDocument/2006/relationships" xmlns:m="http://schemas.openxmlformats.org/officeDocument/2006/math" xmlns:v="urn:schemas-microsoft-com:vml" xmlns:wp14="http://schemas.microsoft.com/office/word/2010/wordprocessingDrawing" xmlns:wp="http://schemas.openxmlformats.org/drawingml/2006/wordprocessingDrawing" xmlns:w10="urn:schemas-microsoft-com:office:word" xmlns:w="http://schemas.openxmlformats.org/wordprocessingml/2006/main" xmlns:w14="http://schemas.microsoft.com/office/word/2010/wordml" xmlns:w15="http://schemas.microsoft.com/office/word/2012/wordml" xmlns:w16se="http://schemas.microsoft.com/office/word/2015/wordml/symex" xmlns:wpg="http://schemas.microsoft.com/office/word/2010/wordprocessingGroup" xmlns:wpi="http://schemas.microsoft.com/office/word/2010/wordprocessingInk" xmlns:wne="http://schemas.microsoft.com/office/word/2006/wordml" xmlns:wps="http://schemas.microsoft.com/office/word/2010/wordprocessingShape" mc:Ignorable="w14 w15 w16se wp14">
   <w:body>
     <w:p>
-      <w:bookmarkStart w:id="0" w:name="_GoBack"/>
-      <w:bookmarkEnd w:id="0"/>
       <w:r>
         <w:t xml:space="preserve">Para demostrar el avance del proyecto desde las primeras semanas, se realizarán </w:t>
       </w:r>
@@ -1382,7 +1380,800 @@
     <w:p/>
     <w:p/>
     <w:p/>
+    <w:p>
+      <w:pPr>
+        <w:rPr>
+          <w:b/>
+          <w:bCs/>
+        </w:rPr>
+      </w:pPr>
+      <w:r>
+        <w:rPr>
+          <w:b/>
+          <w:bCs/>
+        </w:rPr>
+        <w:lastRenderedPageBreak/>
+        <w:t xml:space="preserve">Preparación del </w:t>
+      </w:r>
+      <w:proofErr w:type="spellStart"/>
+      <w:r>
+        <w:rPr>
+          <w:b/>
+          <w:bCs/>
+        </w:rPr>
+        <w:t>dataset</w:t>
+      </w:r>
+      <w:proofErr w:type="spellEnd"/>
+      <w:r>
+        <w:rPr>
+          <w:b/>
+          <w:bCs/>
+        </w:rPr>
+        <w:t xml:space="preserve"> para entrenamiento</w:t>
+      </w:r>
+    </w:p>
+    <w:p>
+      <w:pPr>
+        <w:rPr>
+          <w:b/>
+          <w:bCs/>
+        </w:rPr>
+      </w:pPr>
+      <w:r>
+        <w:rPr>
+          <w:b/>
+          <w:bCs/>
+        </w:rPr>
+        <w:t>Objetivo</w:t>
+      </w:r>
+    </w:p>
+    <w:p>
+      <w:r>
+        <w:t xml:space="preserve">Organizar las radiografías de acuerdo con sus categorías y preparar los datos para que puedan ser utilizados posteriormente en el entrenamiento de una red neuronal </w:t>
+      </w:r>
+      <w:proofErr w:type="spellStart"/>
+      <w:r>
+        <w:t>convolucional</w:t>
+      </w:r>
+      <w:proofErr w:type="spellEnd"/>
+      <w:r>
+        <w:t>.</w:t>
+      </w:r>
+    </w:p>
+    <w:p>
+      <w:pPr>
+        <w:rPr>
+          <w:b/>
+          <w:bCs/>
+        </w:rPr>
+      </w:pPr>
+      <w:r>
+        <w:rPr>
+          <w:b/>
+          <w:bCs/>
+        </w:rPr>
+        <w:t>Acciones realizadas</w:t>
+      </w:r>
+    </w:p>
+    <w:p>
+      <w:pPr>
+        <w:numPr>
+          <w:ilvl w:val="0"/>
+          <w:numId w:val="3"/>
+        </w:numPr>
+      </w:pPr>
+      <w:r>
+        <w:t>Organizar las imágenes de acuerdo con su clasificación.</w:t>
+      </w:r>
+    </w:p>
+    <w:p>
+      <w:pPr>
+        <w:numPr>
+          <w:ilvl w:val="0"/>
+          <w:numId w:val="3"/>
+        </w:numPr>
+      </w:pPr>
+      <w:r>
+        <w:t>Separar las imágenes en conjuntos de entrenamiento, validación y prueba.</w:t>
+      </w:r>
+    </w:p>
+    <w:p>
+      <w:pPr>
+        <w:numPr>
+          <w:ilvl w:val="0"/>
+          <w:numId w:val="3"/>
+        </w:numPr>
+      </w:pPr>
+      <w:r>
+        <w:t>Establecer las categorías Normal y Neumonía.</w:t>
+      </w:r>
+    </w:p>
+    <w:p>
+      <w:pPr>
+        <w:numPr>
+          <w:ilvl w:val="0"/>
+          <w:numId w:val="3"/>
+        </w:numPr>
+      </w:pPr>
+      <w:r>
+        <w:t xml:space="preserve">Utilizar </w:t>
+      </w:r>
+      <w:proofErr w:type="spellStart"/>
+      <w:r>
+        <w:t>TensorFlow</w:t>
+      </w:r>
+      <w:proofErr w:type="spellEnd"/>
+      <w:r>
+        <w:t xml:space="preserve"> para cargar las imágenes.</w:t>
+      </w:r>
+    </w:p>
+    <w:p>
+      <w:pPr>
+        <w:numPr>
+          <w:ilvl w:val="0"/>
+          <w:numId w:val="3"/>
+        </w:numPr>
+      </w:pPr>
+      <w:r>
+        <w:t>Redimensionar automáticamente las imágenes.</w:t>
+      </w:r>
+    </w:p>
+    <w:p>
+      <w:pPr>
+        <w:numPr>
+          <w:ilvl w:val="0"/>
+          <w:numId w:val="3"/>
+        </w:numPr>
+      </w:pPr>
+      <w:r>
+        <w:t>Preparar los datos en lotes para el futuro entrenamiento de la CNN.</w:t>
+      </w:r>
+    </w:p>
+    <w:p>
+      <w:pPr>
+        <w:rPr>
+          <w:b/>
+          <w:bCs/>
+        </w:rPr>
+      </w:pPr>
+      <w:r>
+        <w:rPr>
+          <w:b/>
+          <w:bCs/>
+        </w:rPr>
+        <w:t xml:space="preserve">Organización del </w:t>
+      </w:r>
+      <w:proofErr w:type="spellStart"/>
+      <w:r>
+        <w:rPr>
+          <w:b/>
+          <w:bCs/>
+        </w:rPr>
+        <w:t>dataset</w:t>
+      </w:r>
+      <w:proofErr w:type="spellEnd"/>
+    </w:p>
+    <w:p>
+      <w:r>
+        <w:t>data/</w:t>
+      </w:r>
+    </w:p>
+    <w:p>
+      <w:r>
+        <w:t>│</w:t>
+      </w:r>
+    </w:p>
+    <w:p>
+      <w:r>
+        <w:rPr>
+          <w:rFonts w:ascii="Arial" w:hAnsi="Arial" w:cs="Arial"/>
+        </w:rPr>
+        <w:t>├</w:t>
+      </w:r>
+      <w:r>
+        <w:rPr>
+          <w:rFonts w:ascii="Calibri" w:hAnsi="Calibri" w:cs="Calibri"/>
+        </w:rPr>
+        <w:t>──</w:t>
+      </w:r>
+      <w:r>
+        <w:t xml:space="preserve"> </w:t>
+      </w:r>
+      <w:proofErr w:type="spellStart"/>
+      <w:r>
+        <w:t>train</w:t>
+      </w:r>
+      <w:proofErr w:type="spellEnd"/>
+      <w:r>
+        <w:t>/</w:t>
+      </w:r>
+    </w:p>
+    <w:p>
+      <w:r>
+        <w:t xml:space="preserve">│   </w:t>
+      </w:r>
+      <w:r>
+        <w:rPr>
+          <w:rFonts w:ascii="Arial" w:hAnsi="Arial" w:cs="Arial"/>
+        </w:rPr>
+        <w:t>├</w:t>
+      </w:r>
+      <w:r>
+        <w:rPr>
+          <w:rFonts w:ascii="Calibri" w:hAnsi="Calibri" w:cs="Calibri"/>
+        </w:rPr>
+        <w:t>──</w:t>
+      </w:r>
+      <w:r>
+        <w:t xml:space="preserve"> NORMAL/</w:t>
+      </w:r>
+    </w:p>
+    <w:p>
+      <w:r>
+        <w:t>│   └── PNEUMONIA/</w:t>
+      </w:r>
+    </w:p>
+    <w:p>
+      <w:r>
+        <w:t>│</w:t>
+      </w:r>
+    </w:p>
+    <w:p>
+      <w:r>
+        <w:rPr>
+          <w:rFonts w:ascii="Arial" w:hAnsi="Arial" w:cs="Arial"/>
+        </w:rPr>
+        <w:t>├</w:t>
+      </w:r>
+      <w:r>
+        <w:rPr>
+          <w:rFonts w:ascii="Calibri" w:hAnsi="Calibri" w:cs="Calibri"/>
+        </w:rPr>
+        <w:t>──</w:t>
+      </w:r>
+      <w:r>
+        <w:t xml:space="preserve"> </w:t>
+      </w:r>
+      <w:proofErr w:type="spellStart"/>
+      <w:r>
+        <w:t>validation</w:t>
+      </w:r>
+      <w:proofErr w:type="spellEnd"/>
+      <w:r>
+        <w:t>/</w:t>
+      </w:r>
+    </w:p>
+    <w:p>
+      <w:r>
+        <w:t xml:space="preserve">│   </w:t>
+      </w:r>
+      <w:r>
+        <w:rPr>
+          <w:rFonts w:ascii="Arial" w:hAnsi="Arial" w:cs="Arial"/>
+        </w:rPr>
+        <w:t>├</w:t>
+      </w:r>
+      <w:r>
+        <w:rPr>
+          <w:rFonts w:ascii="Calibri" w:hAnsi="Calibri" w:cs="Calibri"/>
+        </w:rPr>
+        <w:t>──</w:t>
+      </w:r>
+      <w:r>
+        <w:t xml:space="preserve"> NORMAL/</w:t>
+      </w:r>
+    </w:p>
+    <w:p>
+      <w:r>
+        <w:t>│   └── PNEUMONIA/</w:t>
+      </w:r>
+    </w:p>
+    <w:p>
+      <w:r>
+        <w:t>│</w:t>
+      </w:r>
+    </w:p>
+    <w:p>
+      <w:r>
+        <w:t>└── test/</w:t>
+      </w:r>
+    </w:p>
+    <w:p>
+      <w:r>
+        <w:t xml:space="preserve">    </w:t>
+      </w:r>
+      <w:r>
+        <w:rPr>
+          <w:rFonts w:ascii="Arial" w:hAnsi="Arial" w:cs="Arial"/>
+        </w:rPr>
+        <w:t>├</w:t>
+      </w:r>
+      <w:r>
+        <w:rPr>
+          <w:rFonts w:ascii="Calibri" w:hAnsi="Calibri" w:cs="Calibri"/>
+        </w:rPr>
+        <w:t>──</w:t>
+      </w:r>
+      <w:r>
+        <w:t xml:space="preserve"> NORMAL/</w:t>
+      </w:r>
+    </w:p>
+    <w:p>
+      <w:r>
+        <w:t xml:space="preserve">    └── PNEUMONIA/</w:t>
+      </w:r>
+    </w:p>
+    <w:p>
+      <w:pPr>
+        <w:rPr>
+          <w:b/>
+          <w:bCs/>
+        </w:rPr>
+      </w:pPr>
+      <w:r>
+        <w:rPr>
+          <w:b/>
+          <w:bCs/>
+        </w:rPr>
+        <w:t xml:space="preserve">Código para preparar el </w:t>
+      </w:r>
+      <w:proofErr w:type="spellStart"/>
+      <w:r>
+        <w:rPr>
+          <w:b/>
+          <w:bCs/>
+        </w:rPr>
+        <w:t>dataset</w:t>
+      </w:r>
+      <w:proofErr w:type="spellEnd"/>
+    </w:p>
+    <w:p>
+      <w:r>
+        <w:t>Se desarrollará el archivo preparar_dataset.py:</w:t>
+      </w:r>
+    </w:p>
+    <w:p>
+      <w:proofErr w:type="spellStart"/>
+      <w:r>
+        <w:t>import</w:t>
+      </w:r>
+      <w:proofErr w:type="spellEnd"/>
+      <w:r>
+        <w:t xml:space="preserve"> </w:t>
+      </w:r>
+      <w:proofErr w:type="spellStart"/>
+      <w:r>
+        <w:t>tensorflow</w:t>
+      </w:r>
+      <w:proofErr w:type="spellEnd"/>
+      <w:r>
+        <w:t xml:space="preserve"> as </w:t>
+      </w:r>
+      <w:proofErr w:type="spellStart"/>
+      <w:r>
+        <w:t>tf</w:t>
+      </w:r>
+      <w:proofErr w:type="spellEnd"/>
+    </w:p>
     <w:p/>
+    <w:p>
+      <w:r>
+        <w:lastRenderedPageBreak/>
+        <w:t>DIRECTORIO_TRAIN = "data/</w:t>
+      </w:r>
+      <w:proofErr w:type="spellStart"/>
+      <w:r>
+        <w:t>train</w:t>
+      </w:r>
+      <w:proofErr w:type="spellEnd"/>
+      <w:r>
+        <w:t>"</w:t>
+      </w:r>
+    </w:p>
+    <w:p>
+      <w:r>
+        <w:t>DIRECTORIO_VALIDACION = "data/</w:t>
+      </w:r>
+      <w:proofErr w:type="spellStart"/>
+      <w:r>
+        <w:t>validation</w:t>
+      </w:r>
+      <w:proofErr w:type="spellEnd"/>
+      <w:r>
+        <w:t>"</w:t>
+      </w:r>
+    </w:p>
+    <w:p>
+      <w:r>
+        <w:t>TAMAÑO_IMAGEN = (224, 224)</w:t>
+      </w:r>
+    </w:p>
+    <w:p>
+      <w:r>
+        <w:t>BATCH_SIZE = 32</w:t>
+      </w:r>
+    </w:p>
+    <w:p>
+      <w:r>
+        <w:t xml:space="preserve"># </w:t>
+      </w:r>
+      <w:proofErr w:type="spellStart"/>
+      <w:r>
+        <w:t>Dataset</w:t>
+      </w:r>
+      <w:proofErr w:type="spellEnd"/>
+      <w:r>
+        <w:t xml:space="preserve"> de entrenamiento</w:t>
+      </w:r>
+    </w:p>
+    <w:p>
+      <w:proofErr w:type="spellStart"/>
+      <w:r>
+        <w:t>train_dataset</w:t>
+      </w:r>
+      <w:proofErr w:type="spellEnd"/>
+      <w:r>
+        <w:t xml:space="preserve"> = </w:t>
+      </w:r>
+      <w:proofErr w:type="spellStart"/>
+      <w:proofErr w:type="gramStart"/>
+      <w:r>
+        <w:t>tf.keras</w:t>
+      </w:r>
+      <w:proofErr w:type="gramEnd"/>
+      <w:r>
+        <w:t>.utils.image_dataset_from_directory</w:t>
+      </w:r>
+      <w:proofErr w:type="spellEnd"/>
+      <w:r>
+        <w:t>(</w:t>
+      </w:r>
+    </w:p>
+    <w:p>
+      <w:r>
+        <w:t xml:space="preserve">    DIRECTORIO_TRAIN,</w:t>
+      </w:r>
+    </w:p>
+    <w:p>
+      <w:r>
+        <w:t xml:space="preserve">    </w:t>
+      </w:r>
+      <w:proofErr w:type="spellStart"/>
+      <w:r>
+        <w:t>image_size</w:t>
+      </w:r>
+      <w:proofErr w:type="spellEnd"/>
+      <w:r>
+        <w:t>=TAMAÑO_IMAGEN,</w:t>
+      </w:r>
+    </w:p>
+    <w:p>
+      <w:r>
+        <w:t xml:space="preserve">    </w:t>
+      </w:r>
+      <w:proofErr w:type="spellStart"/>
+      <w:r>
+        <w:t>batch_size</w:t>
+      </w:r>
+      <w:proofErr w:type="spellEnd"/>
+      <w:r>
+        <w:t>=BATCH_SIZE,</w:t>
+      </w:r>
+    </w:p>
+    <w:p>
+      <w:r>
+        <w:t xml:space="preserve">    </w:t>
+      </w:r>
+      <w:proofErr w:type="spellStart"/>
+      <w:r>
+        <w:t>color_mode</w:t>
+      </w:r>
+      <w:proofErr w:type="spellEnd"/>
+      <w:r>
+        <w:t>="</w:t>
+      </w:r>
+      <w:proofErr w:type="spellStart"/>
+      <w:r>
+        <w:t>grayscale</w:t>
+      </w:r>
+      <w:proofErr w:type="spellEnd"/>
+      <w:r>
+        <w:t>"</w:t>
+      </w:r>
+    </w:p>
+    <w:p>
+      <w:r>
+        <w:t>)</w:t>
+      </w:r>
+    </w:p>
+    <w:p>
+      <w:r>
+        <w:t xml:space="preserve"># </w:t>
+      </w:r>
+      <w:proofErr w:type="spellStart"/>
+      <w:r>
+        <w:t>Dataset</w:t>
+      </w:r>
+      <w:proofErr w:type="spellEnd"/>
+      <w:r>
+        <w:t xml:space="preserve"> de validación</w:t>
+      </w:r>
+    </w:p>
+    <w:p>
+      <w:proofErr w:type="spellStart"/>
+      <w:r>
+        <w:t>validation_dataset</w:t>
+      </w:r>
+      <w:proofErr w:type="spellEnd"/>
+      <w:r>
+        <w:t xml:space="preserve"> = </w:t>
+      </w:r>
+      <w:proofErr w:type="spellStart"/>
+      <w:proofErr w:type="gramStart"/>
+      <w:r>
+        <w:t>tf.keras</w:t>
+      </w:r>
+      <w:proofErr w:type="gramEnd"/>
+      <w:r>
+        <w:t>.utils.image_dataset_from_directory</w:t>
+      </w:r>
+      <w:proofErr w:type="spellEnd"/>
+      <w:r>
+        <w:t>(</w:t>
+      </w:r>
+    </w:p>
+    <w:p>
+      <w:r>
+        <w:t xml:space="preserve">    DIRECTORIO_VALIDACION,</w:t>
+      </w:r>
+    </w:p>
+    <w:p>
+      <w:r>
+        <w:t xml:space="preserve">    </w:t>
+      </w:r>
+      <w:proofErr w:type="spellStart"/>
+      <w:r>
+        <w:t>image_size</w:t>
+      </w:r>
+      <w:proofErr w:type="spellEnd"/>
+      <w:r>
+        <w:t>=TAMAÑO_IMAGEN,</w:t>
+      </w:r>
+    </w:p>
+    <w:p>
+      <w:r>
+        <w:t xml:space="preserve">    </w:t>
+      </w:r>
+      <w:proofErr w:type="spellStart"/>
+      <w:r>
+        <w:t>batch_size</w:t>
+      </w:r>
+      <w:proofErr w:type="spellEnd"/>
+      <w:r>
+        <w:t>=BATCH_SIZE,</w:t>
+      </w:r>
+    </w:p>
+    <w:p>
+      <w:r>
+        <w:t xml:space="preserve">    </w:t>
+      </w:r>
+      <w:proofErr w:type="spellStart"/>
+      <w:r>
+        <w:t>color_mode</w:t>
+      </w:r>
+      <w:proofErr w:type="spellEnd"/>
+      <w:r>
+        <w:t>="</w:t>
+      </w:r>
+      <w:proofErr w:type="spellStart"/>
+      <w:r>
+        <w:t>grayscale</w:t>
+      </w:r>
+      <w:proofErr w:type="spellEnd"/>
+      <w:r>
+        <w:t>"</w:t>
+      </w:r>
+    </w:p>
+    <w:p>
+      <w:r>
+        <w:t>)</w:t>
+      </w:r>
+    </w:p>
+    <w:p>
+      <w:proofErr w:type="spellStart"/>
+      <w:proofErr w:type="gramStart"/>
+      <w:r>
+        <w:t>print</w:t>
+      </w:r>
+      <w:proofErr w:type="spellEnd"/>
+      <w:r>
+        <w:t>(</w:t>
+      </w:r>
+      <w:proofErr w:type="gramEnd"/>
+      <w:r>
+        <w:t xml:space="preserve">"Clases:", </w:t>
+      </w:r>
+      <w:proofErr w:type="spellStart"/>
+      <w:r>
+        <w:t>train_dataset.class_names</w:t>
+      </w:r>
+      <w:proofErr w:type="spellEnd"/>
+      <w:r>
+        <w:t>)</w:t>
+      </w:r>
+    </w:p>
+    <w:p>
+      <w:proofErr w:type="spellStart"/>
+      <w:proofErr w:type="gramStart"/>
+      <w:r>
+        <w:t>print</w:t>
+      </w:r>
+      <w:proofErr w:type="spellEnd"/>
+      <w:r>
+        <w:t>(</w:t>
+      </w:r>
+      <w:proofErr w:type="gramEnd"/>
+      <w:r>
+        <w:t>"</w:t>
+      </w:r>
+      <w:proofErr w:type="spellStart"/>
+      <w:r>
+        <w:t>Dataset</w:t>
+      </w:r>
+      <w:proofErr w:type="spellEnd"/>
+      <w:r>
+        <w:t xml:space="preserve"> preparado correctamente.")</w:t>
+      </w:r>
+    </w:p>
+    <w:p>
+      <w:pPr>
+        <w:rPr>
+          <w:b/>
+          <w:bCs/>
+        </w:rPr>
+      </w:pPr>
+      <w:r>
+        <w:rPr>
+          <w:b/>
+          <w:bCs/>
+        </w:rPr>
+        <w:t>Resultado esperado</w:t>
+      </w:r>
+    </w:p>
+    <w:p>
+      <w:r>
+        <w:t xml:space="preserve">El programa deberá identificar automáticamente las categorías existentes en las carpetas del </w:t>
+      </w:r>
+      <w:proofErr w:type="spellStart"/>
+      <w:r>
+        <w:t>dataset</w:t>
+      </w:r>
+      <w:proofErr w:type="spellEnd"/>
+      <w:r>
+        <w:t>.</w:t>
+      </w:r>
+    </w:p>
+    <w:p>
+      <w:r>
+        <w:t>Por ejemplo:</w:t>
+      </w:r>
+    </w:p>
+    <w:p>
+      <w:r>
+        <w:t>Clases: ['NORMAL', 'PNEUMONIA']</w:t>
+      </w:r>
+    </w:p>
+    <w:p>
+      <w:proofErr w:type="spellStart"/>
+      <w:r>
+        <w:t>Dataset</w:t>
+      </w:r>
+      <w:proofErr w:type="spellEnd"/>
+      <w:r>
+        <w:t xml:space="preserve"> preparado correctamente.</w:t>
+      </w:r>
+    </w:p>
+    <w:p>
+      <w:r>
+        <w:t xml:space="preserve">De esta manera, las radiografías estarán preparadas para ser utilizadas en la siguiente etapa del proyecto, donde se desarrollará y entrenará la red neuronal </w:t>
+      </w:r>
+      <w:proofErr w:type="spellStart"/>
+      <w:r>
+        <w:t>convolucional</w:t>
+      </w:r>
+      <w:proofErr w:type="spellEnd"/>
+      <w:r>
+        <w:t>.</w:t>
+      </w:r>
+    </w:p>
+    <w:p>
+      <w:pPr>
+        <w:rPr>
+          <w:b/>
+          <w:bCs/>
+        </w:rPr>
+      </w:pPr>
+      <w:r>
+        <w:rPr>
+          <w:b/>
+          <w:bCs/>
+        </w:rPr>
+        <w:t>Producto Mínimo Viable</w:t>
+      </w:r>
+    </w:p>
+    <w:p>
+      <w:r>
+        <w:t>Al finalizar este tercer avance, el proyecto deberá contar con:</w:t>
+      </w:r>
+    </w:p>
+    <w:p>
+      <w:proofErr w:type="spellStart"/>
+      <w:r>
+        <w:rPr>
+          <w:b/>
+          <w:bCs/>
+        </w:rPr>
+        <w:lastRenderedPageBreak/>
+        <w:t>Dataset</w:t>
+      </w:r>
+      <w:proofErr w:type="spellEnd"/>
+      <w:r>
+        <w:rPr>
+          <w:b/>
+          <w:bCs/>
+        </w:rPr>
+        <w:t xml:space="preserve"> organizado → imágenes clasificadas → datos cargados mediante </w:t>
+      </w:r>
+      <w:proofErr w:type="spellStart"/>
+      <w:r>
+        <w:rPr>
+          <w:b/>
+          <w:bCs/>
+        </w:rPr>
+        <w:t>TensorFlow</w:t>
+      </w:r>
+      <w:proofErr w:type="spellEnd"/>
+      <w:r>
+        <w:rPr>
+          <w:b/>
+          <w:bCs/>
+        </w:rPr>
+        <w:t xml:space="preserve"> → datos preparados para entrenar la CNN.</w:t>
+      </w:r>
+    </w:p>
+    <w:p>
+      <w:proofErr w:type="spellStart"/>
+      <w:r>
+        <w:t>feat</w:t>
+      </w:r>
+      <w:proofErr w:type="spellEnd"/>
+      <w:r>
+        <w:t xml:space="preserve">: preparar </w:t>
+      </w:r>
+      <w:proofErr w:type="spellStart"/>
+      <w:r>
+        <w:t>dataset</w:t>
+      </w:r>
+      <w:proofErr w:type="spellEnd"/>
+      <w:r>
+        <w:t xml:space="preserve"> para entrenamiento</w:t>
+      </w:r>
+    </w:p>
+    <w:p>
+      <w:r>
+        <w:t xml:space="preserve">Este </w:t>
+      </w:r>
+      <w:proofErr w:type="spellStart"/>
+      <w:r>
+        <w:t>commit</w:t>
+      </w:r>
+      <w:proofErr w:type="spellEnd"/>
+      <w:r>
+        <w:t xml:space="preserve"> representa el cierre de la primera etapa de desarrollo, dejando preparada la información necesaria para comenzar con la construcción del modelo de Inteligencia Artificial.</w:t>
+      </w:r>
+      <w:bookmarkStart w:id="0" w:name="_GoBack"/>
+      <w:bookmarkEnd w:id="0"/>
+    </w:p>
     <w:p/>
     <w:p/>
     <w:p/>
@@ -1630,11 +2421,127 @@
       </w:pPr>
     </w:lvl>
   </w:abstractNum>
+  <w:abstractNum w:abstractNumId="2" w15:restartNumberingAfterBreak="0">
+    <w:nsid w:val="590B40B7"/>
+    <w:multiLevelType w:val="multilevel"/>
+    <w:tmpl w:val="E5161D06"/>
+    <w:lvl w:ilvl="0">
+      <w:start w:val="1"/>
+      <w:numFmt w:val="decimal"/>
+      <w:lvlText w:val="%1."/>
+      <w:lvlJc w:val="left"/>
+      <w:pPr>
+        <w:tabs>
+          <w:tab w:val="num" w:pos="720"/>
+        </w:tabs>
+        <w:ind w:left="720" w:hanging="360"/>
+      </w:pPr>
+    </w:lvl>
+    <w:lvl w:ilvl="1" w:tentative="1">
+      <w:start w:val="1"/>
+      <w:numFmt w:val="decimal"/>
+      <w:lvlText w:val="%2."/>
+      <w:lvlJc w:val="left"/>
+      <w:pPr>
+        <w:tabs>
+          <w:tab w:val="num" w:pos="1440"/>
+        </w:tabs>
+        <w:ind w:left="1440" w:hanging="360"/>
+      </w:pPr>
+    </w:lvl>
+    <w:lvl w:ilvl="2" w:tentative="1">
+      <w:start w:val="1"/>
+      <w:numFmt w:val="decimal"/>
+      <w:lvlText w:val="%3."/>
+      <w:lvlJc w:val="left"/>
+      <w:pPr>
+        <w:tabs>
+          <w:tab w:val="num" w:pos="2160"/>
+        </w:tabs>
+        <w:ind w:left="2160" w:hanging="360"/>
+      </w:pPr>
+    </w:lvl>
+    <w:lvl w:ilvl="3" w:tentative="1">
+      <w:start w:val="1"/>
+      <w:numFmt w:val="decimal"/>
+      <w:lvlText w:val="%4."/>
+      <w:lvlJc w:val="left"/>
+      <w:pPr>
+        <w:tabs>
+          <w:tab w:val="num" w:pos="2880"/>
+        </w:tabs>
+        <w:ind w:left="2880" w:hanging="360"/>
+      </w:pPr>
+    </w:lvl>
+    <w:lvl w:ilvl="4" w:tentative="1">
+      <w:start w:val="1"/>
+      <w:numFmt w:val="decimal"/>
+      <w:lvlText w:val="%5."/>
+      <w:lvlJc w:val="left"/>
+      <w:pPr>
+        <w:tabs>
+          <w:tab w:val="num" w:pos="3600"/>
+        </w:tabs>
+        <w:ind w:left="3600" w:hanging="360"/>
+      </w:pPr>
+    </w:lvl>
+    <w:lvl w:ilvl="5" w:tentative="1">
+      <w:start w:val="1"/>
+      <w:numFmt w:val="decimal"/>
+      <w:lvlText w:val="%6."/>
+      <w:lvlJc w:val="left"/>
+      <w:pPr>
+        <w:tabs>
+          <w:tab w:val="num" w:pos="4320"/>
+        </w:tabs>
+        <w:ind w:left="4320" w:hanging="360"/>
+      </w:pPr>
+    </w:lvl>
+    <w:lvl w:ilvl="6" w:tentative="1">
+      <w:start w:val="1"/>
+      <w:numFmt w:val="decimal"/>
+      <w:lvlText w:val="%7."/>
+      <w:lvlJc w:val="left"/>
+      <w:pPr>
+        <w:tabs>
+          <w:tab w:val="num" w:pos="5040"/>
+        </w:tabs>
+        <w:ind w:left="5040" w:hanging="360"/>
+      </w:pPr>
+    </w:lvl>
+    <w:lvl w:ilvl="7" w:tentative="1">
+      <w:start w:val="1"/>
+      <w:numFmt w:val="decimal"/>
+      <w:lvlText w:val="%8."/>
+      <w:lvlJc w:val="left"/>
+      <w:pPr>
+        <w:tabs>
+          <w:tab w:val="num" w:pos="5760"/>
+        </w:tabs>
+        <w:ind w:left="5760" w:hanging="360"/>
+      </w:pPr>
+    </w:lvl>
+    <w:lvl w:ilvl="8" w:tentative="1">
+      <w:start w:val="1"/>
+      <w:numFmt w:val="decimal"/>
+      <w:lvlText w:val="%9."/>
+      <w:lvlJc w:val="left"/>
+      <w:pPr>
+        <w:tabs>
+          <w:tab w:val="num" w:pos="6480"/>
+        </w:tabs>
+        <w:ind w:left="6480" w:hanging="360"/>
+      </w:pPr>
+    </w:lvl>
+  </w:abstractNum>
   <w:num w:numId="1">
     <w:abstractNumId w:val="1"/>
   </w:num>
   <w:num w:numId="2">
     <w:abstractNumId w:val="0"/>
+  </w:num>
+  <w:num w:numId="3">
+    <w:abstractNumId w:val="2"/>
   </w:num>
 </w:numbering>
 </file>

</xml_diff>